<commit_message>
actualizacion BD y plantillas
</commit_message>
<xml_diff>
--- a/Inputs/Templates/MF BBVA.docx
+++ b/Inputs/Templates/MF BBVA.docx
@@ -1,6 +1,6 @@
 
 <file path=word/document.xml><?xml version="1.0" encoding="utf-8"?>
-<w:document xmlns:wpc="http://schemas.microsoft.com/office/word/2010/wordprocessingCanvas" xmlns:cx="http://schemas.microsoft.com/office/drawing/2014/chartex" xmlns:cx1="http://schemas.microsoft.com/office/drawing/2015/9/8/chartex" xmlns:cx2="http://schemas.microsoft.com/office/drawing/2015/10/21/chartex" xmlns:cx3="http://schemas.microsoft.com/office/drawing/2016/5/9/chartex" xmlns:cx4="http://schemas.microsoft.com/office/drawing/2016/5/10/chartex" xmlns:cx5="http://schemas.microsoft.com/office/drawing/2016/5/11/chartex" xmlns:cx6="http://schemas.microsoft.com/office/drawing/2016/5/12/chartex" xmlns:cx7="http://schemas.microsoft.com/office/drawing/2016/5/13/chartex" xmlns:cx8="http://schemas.microsoft.com/office/drawing/2016/5/14/chartex" xmlns:mc="http://schemas.openxmlformats.org/markup-compatibility/2006" xmlns:aink="http://schemas.microsoft.com/office/drawing/2016/ink" xmlns:am3d="http://schemas.microsoft.com/office/drawing/2017/model3d" xmlns:o="urn:schemas-microsoft-com:office:office" xmlns:oel="http://schemas.microsoft.com/office/2019/extlst" xmlns:r="http://schemas.openxmlformats.org/officeDocument/2006/relationships" xmlns:m="http://schemas.openxmlformats.org/officeDocument/2006/math" xmlns:v="urn:schemas-microsoft-com:vml" xmlns:wp14="http://schemas.microsoft.com/office/word/2010/wordprocessingDrawing" xmlns:wp="http://schemas.openxmlformats.org/drawingml/2006/wordprocessingDrawing" xmlns:w10="urn:schemas-microsoft-com:office:word" xmlns:w="http://schemas.openxmlformats.org/wordprocessingml/2006/main" xmlns:w14="http://schemas.microsoft.com/office/word/2010/wordml" xmlns:w15="http://schemas.microsoft.com/office/word/2012/wordml" xmlns:w16cex="http://schemas.microsoft.com/office/word/2018/wordml/cex" xmlns:w16cid="http://schemas.microsoft.com/office/word/2016/wordml/cid" xmlns:w16="http://schemas.microsoft.com/office/word/2018/wordml" xmlns:w16sdtdh="http://schemas.microsoft.com/office/word/2020/wordml/sdtdatahash" xmlns:w16se="http://schemas.microsoft.com/office/word/2015/wordml/symex" xmlns:wpg="http://schemas.microsoft.com/office/word/2010/wordprocessingGroup" xmlns:wpi="http://schemas.microsoft.com/office/word/2010/wordprocessingInk" xmlns:wne="http://schemas.microsoft.com/office/word/2006/wordml" xmlns:wps="http://schemas.microsoft.com/office/word/2010/wordprocessingShape" mc:Ignorable="w14 w15 w16se w16cid w16 w16cex w16sdtdh wp14">
+<w:document xmlns:wpc="http://schemas.microsoft.com/office/word/2010/wordprocessingCanvas" xmlns:cx="http://schemas.microsoft.com/office/drawing/2014/chartex" xmlns:cx1="http://schemas.microsoft.com/office/drawing/2015/9/8/chartex" xmlns:cx2="http://schemas.microsoft.com/office/drawing/2015/10/21/chartex" xmlns:cx3="http://schemas.microsoft.com/office/drawing/2016/5/9/chartex" xmlns:cx4="http://schemas.microsoft.com/office/drawing/2016/5/10/chartex" xmlns:cx5="http://schemas.microsoft.com/office/drawing/2016/5/11/chartex" xmlns:cx6="http://schemas.microsoft.com/office/drawing/2016/5/12/chartex" xmlns:cx7="http://schemas.microsoft.com/office/drawing/2016/5/13/chartex" xmlns:cx8="http://schemas.microsoft.com/office/drawing/2016/5/14/chartex" xmlns:mc="http://schemas.openxmlformats.org/markup-compatibility/2006" xmlns:aink="http://schemas.microsoft.com/office/drawing/2016/ink" xmlns:am3d="http://schemas.microsoft.com/office/drawing/2017/model3d" xmlns:o="urn:schemas-microsoft-com:office:office" xmlns:oel="http://schemas.microsoft.com/office/2019/extlst" xmlns:r="http://schemas.openxmlformats.org/officeDocument/2006/relationships" xmlns:m="http://schemas.openxmlformats.org/officeDocument/2006/math" xmlns:v="urn:schemas-microsoft-com:vml" xmlns:wp14="http://schemas.microsoft.com/office/word/2010/wordprocessingDrawing" xmlns:wp="http://schemas.openxmlformats.org/drawingml/2006/wordprocessingDrawing" xmlns:w10="urn:schemas-microsoft-com:office:word" xmlns:w="http://schemas.openxmlformats.org/wordprocessingml/2006/main" xmlns:w14="http://schemas.microsoft.com/office/word/2010/wordml" xmlns:w15="http://schemas.microsoft.com/office/word/2012/wordml" xmlns:w16cex="http://schemas.microsoft.com/office/word/2018/wordml/cex" xmlns:w16cid="http://schemas.microsoft.com/office/word/2016/wordml/cid" xmlns:w16="http://schemas.microsoft.com/office/word/2018/wordml" xmlns:w16du="http://schemas.microsoft.com/office/word/2023/wordml/word16du" xmlns:w16sdtdh="http://schemas.microsoft.com/office/word/2020/wordml/sdtdatahash" xmlns:w16se="http://schemas.microsoft.com/office/word/2015/wordml/symex" xmlns:wpg="http://schemas.microsoft.com/office/word/2010/wordprocessingGroup" xmlns:wpi="http://schemas.microsoft.com/office/word/2010/wordprocessingInk" xmlns:wne="http://schemas.microsoft.com/office/word/2006/wordml" xmlns:wps="http://schemas.microsoft.com/office/word/2010/wordprocessingShape" mc:Ignorable="w14 w15 w16se w16cid w16 w16cex w16sdtdh w16du wp14">
   <w:body>
     <w:p>
       <w:pPr>
@@ -75,37 +75,12 @@
             <w:r>
               <w:t xml:space="preserve">La sucursal </w:t>
             </w:r>
-            <w:proofErr w:type="gramStart"/>
             <w:r>
               <w:rPr>
                 <w:b/>
                 <w:bCs/>
               </w:rPr>
-              <w:t xml:space="preserve">{{ </w:t>
-            </w:r>
-            <w:proofErr w:type="spellStart"/>
-            <w:r>
-              <w:rPr>
-                <w:b/>
-                <w:bCs/>
-              </w:rPr>
-              <w:t>nombre</w:t>
-            </w:r>
-            <w:proofErr w:type="gramEnd"/>
-            <w:r>
-              <w:rPr>
-                <w:b/>
-                <w:bCs/>
-              </w:rPr>
-              <w:t>_comercial</w:t>
-            </w:r>
-            <w:proofErr w:type="spellEnd"/>
-            <w:r>
-              <w:rPr>
-                <w:b/>
-                <w:bCs/>
-              </w:rPr>
-              <w:t xml:space="preserve"> }}</w:t>
+              <w:t>{{ nombre_comercial }}</w:t>
             </w:r>
             <w:r>
               <w:t xml:space="preserve"> se ubica frente a una vialidad altamente transitada, colinda con otros inmuebles de servicios con giro comercial. </w:t>
@@ -117,15 +92,7 @@
               <w:jc w:val="both"/>
             </w:pPr>
             <w:r>
-              <w:t xml:space="preserve">El horario de atención de servicios 08:30 a 16:00 </w:t>
-            </w:r>
-            <w:proofErr w:type="spellStart"/>
-            <w:r>
-              <w:t>hrs</w:t>
-            </w:r>
-            <w:proofErr w:type="spellEnd"/>
-            <w:r>
-              <w:t xml:space="preserve">.   </w:t>
+              <w:t xml:space="preserve">El horario de atención de servicios 08:30 a 16:00 hrs.   </w:t>
             </w:r>
           </w:p>
           <w:p>
@@ -140,15 +107,7 @@
               <w:jc w:val="both"/>
             </w:pPr>
             <w:r>
-              <w:t xml:space="preserve">Cuenta con </w:t>
-            </w:r>
-            <w:proofErr w:type="gramStart"/>
-            <w:r>
-              <w:t>{{ trabajadores</w:t>
-            </w:r>
-            <w:proofErr w:type="gramEnd"/>
-            <w:r>
-              <w:t xml:space="preserve"> }} empleados fijos y afluencia durante el día de {{ visitantes }} personas.</w:t>
+              <w:t>Cuenta con {{ trabajadores }} empleados fijos y afluencia durante el día de {{ visitantes }} personas.</w:t>
             </w:r>
           </w:p>
         </w:tc>
@@ -162,13 +121,8 @@
               <w:spacing w:before="0"/>
               <w:jc w:val="center"/>
             </w:pPr>
-            <w:proofErr w:type="gramStart"/>
-            <w:r>
-              <w:t>{{ fachada</w:t>
-            </w:r>
-            <w:proofErr w:type="gramEnd"/>
-            <w:r>
-              <w:t>1 }}</w:t>
+            <w:r>
+              <w:t>{{ fachada1 }}</w:t>
             </w:r>
           </w:p>
         </w:tc>
@@ -217,13 +171,8 @@
               <w:spacing w:before="0"/>
               <w:jc w:val="center"/>
             </w:pPr>
-            <w:proofErr w:type="gramStart"/>
-            <w:r>
-              <w:t>{{ mueble</w:t>
-            </w:r>
-            <w:proofErr w:type="gramEnd"/>
-            <w:r>
-              <w:t xml:space="preserve"> (1) }}</w:t>
+            <w:r>
+              <w:t>{{ mueble1 }}</w:t>
             </w:r>
           </w:p>
         </w:tc>
@@ -256,13 +205,8 @@
               <w:spacing w:before="0"/>
               <w:jc w:val="center"/>
             </w:pPr>
-            <w:proofErr w:type="gramStart"/>
-            <w:r>
-              <w:t>{{ ruta</w:t>
-            </w:r>
-            <w:proofErr w:type="gramEnd"/>
-            <w:r>
-              <w:t xml:space="preserve"> (1) }}</w:t>
+            <w:r>
+              <w:t>{{ ruta1 }}</w:t>
             </w:r>
           </w:p>
         </w:tc>
@@ -352,14 +296,12 @@
               <w:spacing w:before="0"/>
               <w:jc w:val="center"/>
             </w:pPr>
-            <w:proofErr w:type="gramStart"/>
             <w:r>
               <w:t xml:space="preserve">{{ </w:t>
             </w:r>
             <w:r>
               <w:t>ext</w:t>
             </w:r>
-            <w:proofErr w:type="gramEnd"/>
             <w:r>
               <w:t>1 }}</w:t>
             </w:r>
@@ -415,14 +357,12 @@
               <w:spacing w:before="0"/>
               <w:jc w:val="center"/>
             </w:pPr>
-            <w:proofErr w:type="gramStart"/>
             <w:r>
               <w:t xml:space="preserve">{{ </w:t>
             </w:r>
             <w:r>
               <w:t>techo</w:t>
             </w:r>
-            <w:proofErr w:type="gramEnd"/>
             <w:r>
               <w:t xml:space="preserve"> }}</w:t>
             </w:r>
@@ -457,16 +397,11 @@
               <w:spacing w:before="0"/>
               <w:jc w:val="center"/>
             </w:pPr>
-            <w:proofErr w:type="gramStart"/>
             <w:r>
               <w:t xml:space="preserve">{{ </w:t>
             </w:r>
             <w:r>
-              <w:t>sim</w:t>
-            </w:r>
-            <w:proofErr w:type="gramEnd"/>
-            <w:r>
-              <w:t>3</w:t>
+              <w:t>sim3</w:t>
             </w:r>
             <w:r>
               <w:t xml:space="preserve"> }}</w:t>
@@ -484,16 +419,11 @@
               <w:spacing w:before="0"/>
               <w:jc w:val="center"/>
             </w:pPr>
-            <w:proofErr w:type="gramStart"/>
             <w:r>
               <w:t xml:space="preserve">{{ </w:t>
             </w:r>
             <w:r>
-              <w:t>sim</w:t>
-            </w:r>
-            <w:proofErr w:type="gramEnd"/>
-            <w:r>
-              <w:t>4</w:t>
+              <w:t>sim4</w:t>
             </w:r>
             <w:r>
               <w:t xml:space="preserve"> }}</w:t>
@@ -565,31 +495,7 @@
               <w:tab/>
             </w:r>
             <w:r>
-              <w:t xml:space="preserve">Ventanas se desconoce característica de intemperización de cristalería, así como espacios de islas de trabajo, cuenta con película </w:t>
-            </w:r>
-            <w:proofErr w:type="gramStart"/>
-            <w:r>
-              <w:t>anti estallido</w:t>
-            </w:r>
-            <w:proofErr w:type="gramEnd"/>
-            <w:r>
-              <w:t xml:space="preserve">. Los tramos de herrería se encuentran pintados sin presentar corrosión, incluido en programa de revisión en </w:t>
-            </w:r>
-            <w:proofErr w:type="spellStart"/>
-            <w:r>
-              <w:t>sujecio</w:t>
-            </w:r>
-            <w:proofErr w:type="spellEnd"/>
-            <w:r>
-              <w:t xml:space="preserve"> </w:t>
-            </w:r>
-            <w:proofErr w:type="spellStart"/>
-            <w:r>
-              <w:t>nes</w:t>
-            </w:r>
-            <w:proofErr w:type="spellEnd"/>
-            <w:r>
-              <w:t xml:space="preserve"> y uniones para evitar piezas en mal estado que condicionen accidente laboral.</w:t>
+              <w:t>Ventanas se desconoce característica de intemperización de cristalería, así como espacios de islas de trabajo, cuenta con película anti estallido. Los tramos de herrería se encuentran pintados sin presentar corrosión, incluido en programa de revisión en sujecio nes y uniones para evitar piezas en mal estado que condicionen accidente laboral.</w:t>
             </w:r>
           </w:p>
         </w:tc>
@@ -603,13 +509,8 @@
               <w:spacing w:before="0"/>
               <w:jc w:val="center"/>
             </w:pPr>
-            <w:proofErr w:type="gramStart"/>
-            <w:r>
-              <w:t>{{ ventanas</w:t>
-            </w:r>
-            <w:proofErr w:type="gramEnd"/>
-            <w:r>
-              <w:t xml:space="preserve"> }}</w:t>
+            <w:r>
+              <w:t>{{ ventanas }}</w:t>
             </w:r>
           </w:p>
         </w:tc>
@@ -642,15 +543,7 @@
               <w:t>Colocar la señalización faltante en áreas de bodega, incluyendo acceso restringido en bodega de materiales, papelería, botiquín transportable, etc.</w:t>
             </w:r>
             <w:r>
-              <w:t xml:space="preserve">  La estantería se encuentra bien empotrada con material colocado </w:t>
-            </w:r>
-            <w:proofErr w:type="gramStart"/>
-            <w:r>
-              <w:t>de acuerdo a</w:t>
-            </w:r>
-            <w:proofErr w:type="gramEnd"/>
-            <w:r>
-              <w:t xml:space="preserve"> peso, con bordes romos sin riesgo para los usuarios.</w:t>
+              <w:t xml:space="preserve">  La estantería se encuentra bien empotrada con material colocado de acuerdo a peso, con bordes romos sin riesgo para los usuarios.</w:t>
             </w:r>
           </w:p>
         </w:tc>
@@ -664,13 +557,8 @@
               <w:spacing w:before="0"/>
               <w:jc w:val="center"/>
             </w:pPr>
-            <w:proofErr w:type="gramStart"/>
-            <w:r>
-              <w:t>{{ estantes</w:t>
-            </w:r>
-            <w:proofErr w:type="gramEnd"/>
-            <w:r>
-              <w:t xml:space="preserve"> }}</w:t>
+            <w:r>
+              <w:t>{{ estantes }}</w:t>
             </w:r>
           </w:p>
         </w:tc>
@@ -720,13 +608,8 @@
               <w:spacing w:before="0"/>
               <w:jc w:val="center"/>
             </w:pPr>
-            <w:proofErr w:type="gramStart"/>
-            <w:r>
-              <w:t>{{ pisos</w:t>
-            </w:r>
-            <w:proofErr w:type="gramEnd"/>
-            <w:r>
-              <w:t xml:space="preserve"> }}</w:t>
+            <w:r>
+              <w:t>{{ pisos }}</w:t>
             </w:r>
           </w:p>
         </w:tc>
@@ -831,18 +714,8 @@
               <w:spacing w:before="0"/>
               <w:jc w:val="center"/>
             </w:pPr>
-            <w:proofErr w:type="gramStart"/>
-            <w:r>
-              <w:t xml:space="preserve">{{ </w:t>
-            </w:r>
-            <w:proofErr w:type="spellStart"/>
-            <w:r>
-              <w:t>electrico</w:t>
-            </w:r>
-            <w:proofErr w:type="spellEnd"/>
-            <w:proofErr w:type="gramEnd"/>
-            <w:r>
-              <w:t xml:space="preserve"> </w:t>
+            <w:r>
+              <w:t xml:space="preserve">{{ electrico </w:t>
             </w:r>
             <w:r>
               <w:t>}}</w:t>
@@ -895,16 +768,12 @@
               <w:spacing w:before="0"/>
               <w:jc w:val="center"/>
             </w:pPr>
-            <w:proofErr w:type="gramStart"/>
             <w:r>
               <w:t xml:space="preserve">{{ </w:t>
             </w:r>
-            <w:proofErr w:type="spellStart"/>
             <w:r>
               <w:t>bateria</w:t>
             </w:r>
-            <w:proofErr w:type="spellEnd"/>
-            <w:proofErr w:type="gramEnd"/>
             <w:r>
               <w:t xml:space="preserve"> }}</w:t>
             </w:r>
@@ -962,14 +831,12 @@
               <w:spacing w:before="0"/>
               <w:jc w:val="center"/>
             </w:pPr>
-            <w:proofErr w:type="gramStart"/>
             <w:r>
               <w:t xml:space="preserve">{{ </w:t>
             </w:r>
             <w:r>
               <w:t>alarma</w:t>
             </w:r>
-            <w:proofErr w:type="gramEnd"/>
             <w:r>
               <w:t xml:space="preserve"> }}</w:t>
             </w:r>
@@ -1060,18 +927,11 @@
               <w:spacing w:before="0"/>
               <w:jc w:val="center"/>
             </w:pPr>
-            <w:proofErr w:type="gramStart"/>
             <w:r>
               <w:t xml:space="preserve">{{ </w:t>
             </w:r>
-            <w:proofErr w:type="spellStart"/>
-            <w:r>
-              <w:t>banio</w:t>
-            </w:r>
-            <w:proofErr w:type="spellEnd"/>
-            <w:proofErr w:type="gramEnd"/>
-            <w:r>
-              <w:t xml:space="preserve"> </w:t>
+            <w:r>
+              <w:t xml:space="preserve">banio </w:t>
             </w:r>
             <w:r>
               <w:t>}}</w:t>
@@ -1113,23 +973,7 @@
               <w:tab/>
             </w:r>
             <w:r>
-              <w:t xml:space="preserve">El Cuarto </w:t>
-            </w:r>
-            <w:proofErr w:type="spellStart"/>
-            <w:r>
-              <w:t>on</w:t>
-            </w:r>
-            <w:proofErr w:type="spellEnd"/>
-            <w:r>
-              <w:t xml:space="preserve"> Line se encuentra restringido en su acceso, limpio de almacenaje de combustibles sólidos y otros, con detector de humo vigente, toda la instalación eléctrica bajo resguardo tubo </w:t>
-            </w:r>
-            <w:proofErr w:type="spellStart"/>
-            <w:r>
-              <w:t>conduit</w:t>
-            </w:r>
-            <w:proofErr w:type="spellEnd"/>
-            <w:r>
-              <w:t>, señalizado en sus tableros de control, con sistema de ventilación adecuado.</w:t>
+              <w:t>El Cuarto on Line se encuentra restringido en su acceso, limpio de almacenaje de combustibles sólidos y otros, con detector de humo vigente, toda la instalación eléctrica bajo resguardo tubo conduit, señalizado en sus tableros de control, con sistema de ventilación adecuado.</w:t>
             </w:r>
           </w:p>
         </w:tc>
@@ -1143,14 +987,12 @@
               <w:spacing w:before="0"/>
               <w:jc w:val="center"/>
             </w:pPr>
-            <w:proofErr w:type="gramStart"/>
             <w:r>
               <w:t xml:space="preserve">{{ </w:t>
             </w:r>
             <w:r>
               <w:t>site</w:t>
             </w:r>
-            <w:proofErr w:type="gramEnd"/>
             <w:r>
               <w:t xml:space="preserve"> }}</w:t>
             </w:r>
@@ -1214,14 +1056,12 @@
               <w:spacing w:before="0"/>
               <w:jc w:val="center"/>
             </w:pPr>
-            <w:proofErr w:type="gramStart"/>
             <w:r>
               <w:t xml:space="preserve">{{ </w:t>
             </w:r>
             <w:r>
               <w:t>puerta</w:t>
             </w:r>
-            <w:proofErr w:type="gramEnd"/>
             <w:r>
               <w:t xml:space="preserve"> }}</w:t>
             </w:r>
@@ -1303,15 +1143,7 @@
               </w:r>
             </w:smartTag>
             <w:r>
-              <w:t xml:space="preserve"> de acuerdo con NOM 003 SEGOB 2002 Señales y avisos, cuenta en cantidad y calidad óptima </w:t>
-            </w:r>
-            <w:proofErr w:type="gramStart"/>
-            <w:r>
-              <w:t>de acuerdo a</w:t>
-            </w:r>
-            <w:proofErr w:type="gramEnd"/>
-            <w:r>
-              <w:t xml:space="preserve"> usos de espacios para un mejor desarrollo del plan de evacuación.</w:t>
+              <w:t xml:space="preserve"> de acuerdo con NOM 003 SEGOB 2002 Señales y avisos, cuenta en cantidad y calidad óptima de acuerdo a usos de espacios para un mejor desarrollo del plan de evacuación.</w:t>
             </w:r>
           </w:p>
         </w:tc>
@@ -1325,16 +1157,11 @@
               <w:spacing w:before="0"/>
               <w:jc w:val="center"/>
             </w:pPr>
-            <w:proofErr w:type="gramStart"/>
             <w:r>
               <w:t xml:space="preserve">{{ </w:t>
             </w:r>
             <w:r>
-              <w:t>ruta</w:t>
-            </w:r>
-            <w:proofErr w:type="gramEnd"/>
-            <w:r>
-              <w:t xml:space="preserve">2 </w:t>
+              <w:t xml:space="preserve">ruta2 </w:t>
             </w:r>
             <w:r>
               <w:t>}}</w:t>
@@ -1378,16 +1205,12 @@
               <w:spacing w:before="0"/>
               <w:jc w:val="center"/>
             </w:pPr>
-            <w:proofErr w:type="gramStart"/>
             <w:r>
               <w:t xml:space="preserve">{{ </w:t>
             </w:r>
-            <w:proofErr w:type="spellStart"/>
             <w:r>
               <w:t>botiquin</w:t>
             </w:r>
-            <w:proofErr w:type="spellEnd"/>
-            <w:proofErr w:type="gramEnd"/>
             <w:r>
               <w:t xml:space="preserve"> }}</w:t>
             </w:r>
@@ -1416,15 +1239,7 @@
               <w:tab/>
             </w:r>
             <w:r>
-              <w:t xml:space="preserve">Cuenta con detectores de humo fotoeléctrico </w:t>
-            </w:r>
-            <w:proofErr w:type="gramStart"/>
-            <w:r>
-              <w:t>de acuerdo a</w:t>
-            </w:r>
-            <w:proofErr w:type="gramEnd"/>
-            <w:r>
-              <w:t xml:space="preserve"> norma y área de riesgo se encuentran vigentes, se solicita realizar programa de mantenimiento y seguimiento anual.</w:t>
+              <w:t>Cuenta con detectores de humo fotoeléctrico de acuerdo a norma y área de riesgo se encuentran vigentes, se solicita realizar programa de mantenimiento y seguimiento anual.</w:t>
             </w:r>
           </w:p>
         </w:tc>
@@ -1438,16 +1253,12 @@
               <w:spacing w:before="0"/>
               <w:jc w:val="center"/>
             </w:pPr>
-            <w:proofErr w:type="gramStart"/>
             <w:r>
               <w:t xml:space="preserve">{{ </w:t>
             </w:r>
-            <w:proofErr w:type="spellStart"/>
             <w:r>
               <w:t>dh</w:t>
             </w:r>
-            <w:proofErr w:type="spellEnd"/>
-            <w:proofErr w:type="gramEnd"/>
             <w:r>
               <w:t xml:space="preserve"> }}</w:t>
             </w:r>
@@ -1497,52 +1308,7 @@
           <w:lang w:val="en-US"/>
         </w:rPr>
         <w:lastRenderedPageBreak/>
-        <w:t xml:space="preserve">Lay out </w:t>
-      </w:r>
-      <w:proofErr w:type="spellStart"/>
-      <w:r>
-        <w:rPr>
-          <w:b/>
-          <w:sz w:val="32"/>
-          <w:lang w:val="en-US"/>
-        </w:rPr>
-        <w:t>Sucursal</w:t>
-      </w:r>
-      <w:proofErr w:type="spellEnd"/>
-      <w:r>
-        <w:rPr>
-          <w:b/>
-          <w:sz w:val="32"/>
-          <w:lang w:val="en-US"/>
-        </w:rPr>
-        <w:t xml:space="preserve"> </w:t>
-      </w:r>
-      <w:proofErr w:type="gramStart"/>
-      <w:r>
-        <w:rPr>
-          <w:b/>
-          <w:sz w:val="32"/>
-          <w:lang w:val="en-US"/>
-        </w:rPr>
-        <w:t xml:space="preserve">{{ </w:t>
-      </w:r>
-      <w:proofErr w:type="spellStart"/>
-      <w:r>
-        <w:rPr>
-          <w:b/>
-          <w:sz w:val="32"/>
-          <w:lang w:val="en-US"/>
-        </w:rPr>
-        <w:t>nombre</w:t>
-      </w:r>
-      <w:proofErr w:type="gramEnd"/>
-      <w:r>
-        <w:rPr>
-          <w:b/>
-          <w:sz w:val="32"/>
-          <w:lang w:val="en-US"/>
-        </w:rPr>
-        <w:t>_com</w:t>
+        <w:t>Lay out Sucursal {{ nombre_com</w:t>
       </w:r>
       <w:r>
         <w:rPr>
@@ -1550,16 +1316,7 @@
           <w:sz w:val="32"/>
           <w:lang w:val="en-US"/>
         </w:rPr>
-        <w:t>ercial</w:t>
-      </w:r>
-      <w:proofErr w:type="spellEnd"/>
-      <w:r>
-        <w:rPr>
-          <w:b/>
-          <w:sz w:val="32"/>
-          <w:lang w:val="en-US"/>
-        </w:rPr>
-        <w:t xml:space="preserve"> }}</w:t>
+        <w:t>ercial }}</w:t>
       </w:r>
     </w:p>
     <w:p>
@@ -1617,108 +1374,22 @@
           <w:b/>
         </w:rPr>
       </w:pPr>
-      <w:proofErr w:type="gramStart"/>
       <w:r>
         <w:rPr>
           <w:b/>
         </w:rPr>
-        <w:t xml:space="preserve">{{ </w:t>
+        <w:t>{{ nombre_comercial }}</w:t>
       </w:r>
-      <w:proofErr w:type="spellStart"/>
+    </w:p>
+    <w:p>
+      <w:pPr>
+        <w:jc w:val="center"/>
+      </w:pPr>
       <w:r>
         <w:rPr>
           <w:b/>
         </w:rPr>
-        <w:t>nombre</w:t>
-      </w:r>
-      <w:proofErr w:type="gramEnd"/>
-      <w:r>
-        <w:rPr>
-          <w:b/>
-        </w:rPr>
-        <w:t>_comercial</w:t>
-      </w:r>
-      <w:proofErr w:type="spellEnd"/>
-      <w:r>
-        <w:rPr>
-          <w:b/>
-        </w:rPr>
-        <w:t xml:space="preserve"> }}</w:t>
-      </w:r>
-    </w:p>
-    <w:p>
-      <w:pPr>
-        <w:jc w:val="center"/>
-      </w:pPr>
-      <w:proofErr w:type="gramStart"/>
-      <w:r>
-        <w:rPr>
-          <w:b/>
-        </w:rPr>
-        <w:t>{{ calle</w:t>
-      </w:r>
-      <w:proofErr w:type="gramEnd"/>
-      <w:r>
-        <w:rPr>
-          <w:b/>
-        </w:rPr>
-        <w:t xml:space="preserve"> }} No. </w:t>
-      </w:r>
-      <w:proofErr w:type="gramStart"/>
-      <w:r>
-        <w:rPr>
-          <w:b/>
-        </w:rPr>
-        <w:t xml:space="preserve">{{ </w:t>
-      </w:r>
-      <w:proofErr w:type="spellStart"/>
-      <w:r>
-        <w:rPr>
-          <w:b/>
-        </w:rPr>
-        <w:t>no</w:t>
-      </w:r>
-      <w:proofErr w:type="gramEnd"/>
-      <w:r>
-        <w:rPr>
-          <w:b/>
-        </w:rPr>
-        <w:t>_exterior</w:t>
-      </w:r>
-      <w:proofErr w:type="spellEnd"/>
-      <w:r>
-        <w:rPr>
-          <w:b/>
-        </w:rPr>
-        <w:t xml:space="preserve"> }}{{ </w:t>
-      </w:r>
-      <w:proofErr w:type="spellStart"/>
-      <w:r>
-        <w:rPr>
-          <w:b/>
-        </w:rPr>
-        <w:t>no_interior</w:t>
-      </w:r>
-      <w:proofErr w:type="spellEnd"/>
-      <w:r>
-        <w:rPr>
-          <w:b/>
-        </w:rPr>
-        <w:t xml:space="preserve"> }}, Col. {{ </w:t>
-      </w:r>
-      <w:proofErr w:type="spellStart"/>
-      <w:r>
-        <w:rPr>
-          <w:b/>
-        </w:rPr>
-        <w:t>colonia_barrio</w:t>
-      </w:r>
-      <w:proofErr w:type="spellEnd"/>
-      <w:r>
-        <w:rPr>
-          <w:b/>
-        </w:rPr>
-        <w:t xml:space="preserve"> }}, {{ municipio }}, {{ estado }}</w:t>
+        <w:t>{{ calle }} No. {{ no_exterior }}{{ no_interior }}, Col. {{ colonia_barrio }}, {{ municipio }}, {{ estado }}</w:t>
       </w:r>
       <w:r>
         <w:rPr>
@@ -1739,7 +1410,7 @@
 </file>
 
 <file path=word/endnotes.xml><?xml version="1.0" encoding="utf-8"?>
-<w:endnotes xmlns:wpc="http://schemas.microsoft.com/office/word/2010/wordprocessingCanvas" xmlns:cx="http://schemas.microsoft.com/office/drawing/2014/chartex" xmlns:cx1="http://schemas.microsoft.com/office/drawing/2015/9/8/chartex" xmlns:cx2="http://schemas.microsoft.com/office/drawing/2015/10/21/chartex" xmlns:cx3="http://schemas.microsoft.com/office/drawing/2016/5/9/chartex" xmlns:cx4="http://schemas.microsoft.com/office/drawing/2016/5/10/chartex" xmlns:cx5="http://schemas.microsoft.com/office/drawing/2016/5/11/chartex" xmlns:cx6="http://schemas.microsoft.com/office/drawing/2016/5/12/chartex" xmlns:cx7="http://schemas.microsoft.com/office/drawing/2016/5/13/chartex" xmlns:cx8="http://schemas.microsoft.com/office/drawing/2016/5/14/chartex" xmlns:mc="http://schemas.openxmlformats.org/markup-compatibility/2006" xmlns:aink="http://schemas.microsoft.com/office/drawing/2016/ink" xmlns:am3d="http://schemas.microsoft.com/office/drawing/2017/model3d" xmlns:o="urn:schemas-microsoft-com:office:office" xmlns:oel="http://schemas.microsoft.com/office/2019/extlst" xmlns:r="http://schemas.openxmlformats.org/officeDocument/2006/relationships" xmlns:m="http://schemas.openxmlformats.org/officeDocument/2006/math" xmlns:v="urn:schemas-microsoft-com:vml" xmlns:wp14="http://schemas.microsoft.com/office/word/2010/wordprocessingDrawing" xmlns:wp="http://schemas.openxmlformats.org/drawingml/2006/wordprocessingDrawing" xmlns:w10="urn:schemas-microsoft-com:office:word" xmlns:w="http://schemas.openxmlformats.org/wordprocessingml/2006/main" xmlns:w14="http://schemas.microsoft.com/office/word/2010/wordml" xmlns:w15="http://schemas.microsoft.com/office/word/2012/wordml" xmlns:w16cex="http://schemas.microsoft.com/office/word/2018/wordml/cex" xmlns:w16cid="http://schemas.microsoft.com/office/word/2016/wordml/cid" xmlns:w16="http://schemas.microsoft.com/office/word/2018/wordml" xmlns:w16sdtdh="http://schemas.microsoft.com/office/word/2020/wordml/sdtdatahash" xmlns:w16se="http://schemas.microsoft.com/office/word/2015/wordml/symex" xmlns:wpg="http://schemas.microsoft.com/office/word/2010/wordprocessingGroup" xmlns:wpi="http://schemas.microsoft.com/office/word/2010/wordprocessingInk" xmlns:wne="http://schemas.microsoft.com/office/word/2006/wordml" xmlns:wps="http://schemas.microsoft.com/office/word/2010/wordprocessingShape" mc:Ignorable="w14 w15 w16se w16cid w16 w16cex w16sdtdh wp14">
+<w:endnotes xmlns:wpc="http://schemas.microsoft.com/office/word/2010/wordprocessingCanvas" xmlns:cx="http://schemas.microsoft.com/office/drawing/2014/chartex" xmlns:cx1="http://schemas.microsoft.com/office/drawing/2015/9/8/chartex" xmlns:cx2="http://schemas.microsoft.com/office/drawing/2015/10/21/chartex" xmlns:cx3="http://schemas.microsoft.com/office/drawing/2016/5/9/chartex" xmlns:cx4="http://schemas.microsoft.com/office/drawing/2016/5/10/chartex" xmlns:cx5="http://schemas.microsoft.com/office/drawing/2016/5/11/chartex" xmlns:cx6="http://schemas.microsoft.com/office/drawing/2016/5/12/chartex" xmlns:cx7="http://schemas.microsoft.com/office/drawing/2016/5/13/chartex" xmlns:cx8="http://schemas.microsoft.com/office/drawing/2016/5/14/chartex" xmlns:mc="http://schemas.openxmlformats.org/markup-compatibility/2006" xmlns:aink="http://schemas.microsoft.com/office/drawing/2016/ink" xmlns:am3d="http://schemas.microsoft.com/office/drawing/2017/model3d" xmlns:o="urn:schemas-microsoft-com:office:office" xmlns:oel="http://schemas.microsoft.com/office/2019/extlst" xmlns:r="http://schemas.openxmlformats.org/officeDocument/2006/relationships" xmlns:m="http://schemas.openxmlformats.org/officeDocument/2006/math" xmlns:v="urn:schemas-microsoft-com:vml" xmlns:wp14="http://schemas.microsoft.com/office/word/2010/wordprocessingDrawing" xmlns:wp="http://schemas.openxmlformats.org/drawingml/2006/wordprocessingDrawing" xmlns:w10="urn:schemas-microsoft-com:office:word" xmlns:w="http://schemas.openxmlformats.org/wordprocessingml/2006/main" xmlns:w14="http://schemas.microsoft.com/office/word/2010/wordml" xmlns:w15="http://schemas.microsoft.com/office/word/2012/wordml" xmlns:w16cex="http://schemas.microsoft.com/office/word/2018/wordml/cex" xmlns:w16cid="http://schemas.microsoft.com/office/word/2016/wordml/cid" xmlns:w16="http://schemas.microsoft.com/office/word/2018/wordml" xmlns:w16du="http://schemas.microsoft.com/office/word/2023/wordml/word16du" xmlns:w16sdtdh="http://schemas.microsoft.com/office/word/2020/wordml/sdtdatahash" xmlns:w16se="http://schemas.microsoft.com/office/word/2015/wordml/symex" xmlns:wpg="http://schemas.microsoft.com/office/word/2010/wordprocessingGroup" xmlns:wpi="http://schemas.microsoft.com/office/word/2010/wordprocessingInk" xmlns:wne="http://schemas.microsoft.com/office/word/2006/wordml" xmlns:wps="http://schemas.microsoft.com/office/word/2010/wordprocessingShape" mc:Ignorable="w14 w15 w16se w16cid w16 w16cex w16sdtdh w16du wp14">
   <w:endnote w:type="separator" w:id="-1">
     <w:p>
       <w:pPr>
@@ -1764,7 +1435,7 @@
 </file>
 
 <file path=word/footnotes.xml><?xml version="1.0" encoding="utf-8"?>
-<w:footnotes xmlns:wpc="http://schemas.microsoft.com/office/word/2010/wordprocessingCanvas" xmlns:cx="http://schemas.microsoft.com/office/drawing/2014/chartex" xmlns:cx1="http://schemas.microsoft.com/office/drawing/2015/9/8/chartex" xmlns:cx2="http://schemas.microsoft.com/office/drawing/2015/10/21/chartex" xmlns:cx3="http://schemas.microsoft.com/office/drawing/2016/5/9/chartex" xmlns:cx4="http://schemas.microsoft.com/office/drawing/2016/5/10/chartex" xmlns:cx5="http://schemas.microsoft.com/office/drawing/2016/5/11/chartex" xmlns:cx6="http://schemas.microsoft.com/office/drawing/2016/5/12/chartex" xmlns:cx7="http://schemas.microsoft.com/office/drawing/2016/5/13/chartex" xmlns:cx8="http://schemas.microsoft.com/office/drawing/2016/5/14/chartex" xmlns:mc="http://schemas.openxmlformats.org/markup-compatibility/2006" xmlns:aink="http://schemas.microsoft.com/office/drawing/2016/ink" xmlns:am3d="http://schemas.microsoft.com/office/drawing/2017/model3d" xmlns:o="urn:schemas-microsoft-com:office:office" xmlns:oel="http://schemas.microsoft.com/office/2019/extlst" xmlns:r="http://schemas.openxmlformats.org/officeDocument/2006/relationships" xmlns:m="http://schemas.openxmlformats.org/officeDocument/2006/math" xmlns:v="urn:schemas-microsoft-com:vml" xmlns:wp14="http://schemas.microsoft.com/office/word/2010/wordprocessingDrawing" xmlns:wp="http://schemas.openxmlformats.org/drawingml/2006/wordprocessingDrawing" xmlns:w10="urn:schemas-microsoft-com:office:word" xmlns:w="http://schemas.openxmlformats.org/wordprocessingml/2006/main" xmlns:w14="http://schemas.microsoft.com/office/word/2010/wordml" xmlns:w15="http://schemas.microsoft.com/office/word/2012/wordml" xmlns:w16cex="http://schemas.microsoft.com/office/word/2018/wordml/cex" xmlns:w16cid="http://schemas.microsoft.com/office/word/2016/wordml/cid" xmlns:w16="http://schemas.microsoft.com/office/word/2018/wordml" xmlns:w16sdtdh="http://schemas.microsoft.com/office/word/2020/wordml/sdtdatahash" xmlns:w16se="http://schemas.microsoft.com/office/word/2015/wordml/symex" xmlns:wpg="http://schemas.microsoft.com/office/word/2010/wordprocessingGroup" xmlns:wpi="http://schemas.microsoft.com/office/word/2010/wordprocessingInk" xmlns:wne="http://schemas.microsoft.com/office/word/2006/wordml" xmlns:wps="http://schemas.microsoft.com/office/word/2010/wordprocessingShape" mc:Ignorable="w14 w15 w16se w16cid w16 w16cex w16sdtdh wp14">
+<w:footnotes xmlns:wpc="http://schemas.microsoft.com/office/word/2010/wordprocessingCanvas" xmlns:cx="http://schemas.microsoft.com/office/drawing/2014/chartex" xmlns:cx1="http://schemas.microsoft.com/office/drawing/2015/9/8/chartex" xmlns:cx2="http://schemas.microsoft.com/office/drawing/2015/10/21/chartex" xmlns:cx3="http://schemas.microsoft.com/office/drawing/2016/5/9/chartex" xmlns:cx4="http://schemas.microsoft.com/office/drawing/2016/5/10/chartex" xmlns:cx5="http://schemas.microsoft.com/office/drawing/2016/5/11/chartex" xmlns:cx6="http://schemas.microsoft.com/office/drawing/2016/5/12/chartex" xmlns:cx7="http://schemas.microsoft.com/office/drawing/2016/5/13/chartex" xmlns:cx8="http://schemas.microsoft.com/office/drawing/2016/5/14/chartex" xmlns:mc="http://schemas.openxmlformats.org/markup-compatibility/2006" xmlns:aink="http://schemas.microsoft.com/office/drawing/2016/ink" xmlns:am3d="http://schemas.microsoft.com/office/drawing/2017/model3d" xmlns:o="urn:schemas-microsoft-com:office:office" xmlns:oel="http://schemas.microsoft.com/office/2019/extlst" xmlns:r="http://schemas.openxmlformats.org/officeDocument/2006/relationships" xmlns:m="http://schemas.openxmlformats.org/officeDocument/2006/math" xmlns:v="urn:schemas-microsoft-com:vml" xmlns:wp14="http://schemas.microsoft.com/office/word/2010/wordprocessingDrawing" xmlns:wp="http://schemas.openxmlformats.org/drawingml/2006/wordprocessingDrawing" xmlns:w10="urn:schemas-microsoft-com:office:word" xmlns:w="http://schemas.openxmlformats.org/wordprocessingml/2006/main" xmlns:w14="http://schemas.microsoft.com/office/word/2010/wordml" xmlns:w15="http://schemas.microsoft.com/office/word/2012/wordml" xmlns:w16cex="http://schemas.microsoft.com/office/word/2018/wordml/cex" xmlns:w16cid="http://schemas.microsoft.com/office/word/2016/wordml/cid" xmlns:w16="http://schemas.microsoft.com/office/word/2018/wordml" xmlns:w16du="http://schemas.microsoft.com/office/word/2023/wordml/word16du" xmlns:w16sdtdh="http://schemas.microsoft.com/office/word/2020/wordml/sdtdatahash" xmlns:w16se="http://schemas.microsoft.com/office/word/2015/wordml/symex" xmlns:wpg="http://schemas.microsoft.com/office/word/2010/wordprocessingGroup" xmlns:wpi="http://schemas.microsoft.com/office/word/2010/wordprocessingInk" xmlns:wne="http://schemas.microsoft.com/office/word/2006/wordml" xmlns:wps="http://schemas.microsoft.com/office/word/2010/wordprocessingShape" mc:Ignorable="w14 w15 w16se w16cid w16 w16cex w16sdtdh w16du wp14">
   <w:footnote w:type="separator" w:id="-1">
     <w:p>
       <w:pPr>
@@ -1789,7 +1460,7 @@
 </file>
 
 <file path=word/header1.xml><?xml version="1.0" encoding="utf-8"?>
-<w:hdr xmlns:wpc="http://schemas.microsoft.com/office/word/2010/wordprocessingCanvas" xmlns:cx="http://schemas.microsoft.com/office/drawing/2014/chartex" xmlns:cx1="http://schemas.microsoft.com/office/drawing/2015/9/8/chartex" xmlns:cx2="http://schemas.microsoft.com/office/drawing/2015/10/21/chartex" xmlns:cx3="http://schemas.microsoft.com/office/drawing/2016/5/9/chartex" xmlns:cx4="http://schemas.microsoft.com/office/drawing/2016/5/10/chartex" xmlns:cx5="http://schemas.microsoft.com/office/drawing/2016/5/11/chartex" xmlns:cx6="http://schemas.microsoft.com/office/drawing/2016/5/12/chartex" xmlns:cx7="http://schemas.microsoft.com/office/drawing/2016/5/13/chartex" xmlns:cx8="http://schemas.microsoft.com/office/drawing/2016/5/14/chartex" xmlns:mc="http://schemas.openxmlformats.org/markup-compatibility/2006" xmlns:aink="http://schemas.microsoft.com/office/drawing/2016/ink" xmlns:am3d="http://schemas.microsoft.com/office/drawing/2017/model3d" xmlns:o="urn:schemas-microsoft-com:office:office" xmlns:oel="http://schemas.microsoft.com/office/2019/extlst" xmlns:r="http://schemas.openxmlformats.org/officeDocument/2006/relationships" xmlns:m="http://schemas.openxmlformats.org/officeDocument/2006/math" xmlns:v="urn:schemas-microsoft-com:vml" xmlns:wp14="http://schemas.microsoft.com/office/word/2010/wordprocessingDrawing" xmlns:wp="http://schemas.openxmlformats.org/drawingml/2006/wordprocessingDrawing" xmlns:w10="urn:schemas-microsoft-com:office:word" xmlns:w="http://schemas.openxmlformats.org/wordprocessingml/2006/main" xmlns:w14="http://schemas.microsoft.com/office/word/2010/wordml" xmlns:w15="http://schemas.microsoft.com/office/word/2012/wordml" xmlns:w16cex="http://schemas.microsoft.com/office/word/2018/wordml/cex" xmlns:w16cid="http://schemas.microsoft.com/office/word/2016/wordml/cid" xmlns:w16="http://schemas.microsoft.com/office/word/2018/wordml" xmlns:w16sdtdh="http://schemas.microsoft.com/office/word/2020/wordml/sdtdatahash" xmlns:w16se="http://schemas.microsoft.com/office/word/2015/wordml/symex" xmlns:wpg="http://schemas.microsoft.com/office/word/2010/wordprocessingGroup" xmlns:wpi="http://schemas.microsoft.com/office/word/2010/wordprocessingInk" xmlns:wne="http://schemas.microsoft.com/office/word/2006/wordml" xmlns:wps="http://schemas.microsoft.com/office/word/2010/wordprocessingShape" mc:Ignorable="w14 w15 w16se w16cid w16 w16cex w16sdtdh wp14">
+<w:hdr xmlns:wpc="http://schemas.microsoft.com/office/word/2010/wordprocessingCanvas" xmlns:cx="http://schemas.microsoft.com/office/drawing/2014/chartex" xmlns:cx1="http://schemas.microsoft.com/office/drawing/2015/9/8/chartex" xmlns:cx2="http://schemas.microsoft.com/office/drawing/2015/10/21/chartex" xmlns:cx3="http://schemas.microsoft.com/office/drawing/2016/5/9/chartex" xmlns:cx4="http://schemas.microsoft.com/office/drawing/2016/5/10/chartex" xmlns:cx5="http://schemas.microsoft.com/office/drawing/2016/5/11/chartex" xmlns:cx6="http://schemas.microsoft.com/office/drawing/2016/5/12/chartex" xmlns:cx7="http://schemas.microsoft.com/office/drawing/2016/5/13/chartex" xmlns:cx8="http://schemas.microsoft.com/office/drawing/2016/5/14/chartex" xmlns:mc="http://schemas.openxmlformats.org/markup-compatibility/2006" xmlns:aink="http://schemas.microsoft.com/office/drawing/2016/ink" xmlns:am3d="http://schemas.microsoft.com/office/drawing/2017/model3d" xmlns:o="urn:schemas-microsoft-com:office:office" xmlns:oel="http://schemas.microsoft.com/office/2019/extlst" xmlns:r="http://schemas.openxmlformats.org/officeDocument/2006/relationships" xmlns:m="http://schemas.openxmlformats.org/officeDocument/2006/math" xmlns:v="urn:schemas-microsoft-com:vml" xmlns:wp14="http://schemas.microsoft.com/office/word/2010/wordprocessingDrawing" xmlns:wp="http://schemas.openxmlformats.org/drawingml/2006/wordprocessingDrawing" xmlns:w10="urn:schemas-microsoft-com:office:word" xmlns:w="http://schemas.openxmlformats.org/wordprocessingml/2006/main" xmlns:w14="http://schemas.microsoft.com/office/word/2010/wordml" xmlns:w15="http://schemas.microsoft.com/office/word/2012/wordml" xmlns:w16cex="http://schemas.microsoft.com/office/word/2018/wordml/cex" xmlns:w16cid="http://schemas.microsoft.com/office/word/2016/wordml/cid" xmlns:w16="http://schemas.microsoft.com/office/word/2018/wordml" xmlns:w16du="http://schemas.microsoft.com/office/word/2023/wordml/word16du" xmlns:w16sdtdh="http://schemas.microsoft.com/office/word/2020/wordml/sdtdatahash" xmlns:w16se="http://schemas.microsoft.com/office/word/2015/wordml/symex" xmlns:wpg="http://schemas.microsoft.com/office/word/2010/wordprocessingGroup" xmlns:wpi="http://schemas.microsoft.com/office/word/2010/wordprocessingInk" xmlns:wne="http://schemas.microsoft.com/office/word/2006/wordml" xmlns:wps="http://schemas.microsoft.com/office/word/2010/wordprocessingShape" mc:Ignorable="w14 w15 w16se w16cid w16 w16cex w16sdtdh w16du wp14">
   <w:tbl>
     <w:tblPr>
       <w:tblStyle w:val="Tablaconcuadrcula"/>
@@ -1919,41 +1590,13 @@
               <w:szCs w:val="18"/>
             </w:rPr>
           </w:pPr>
-          <w:proofErr w:type="gramStart"/>
           <w:r>
             <w:rPr>
               <w:b/>
               <w:sz w:val="18"/>
               <w:szCs w:val="18"/>
             </w:rPr>
-            <w:t xml:space="preserve">{{ </w:t>
-          </w:r>
-          <w:proofErr w:type="spellStart"/>
-          <w:r>
-            <w:rPr>
-              <w:b/>
-              <w:sz w:val="18"/>
-              <w:szCs w:val="18"/>
-            </w:rPr>
-            <w:t>nombre</w:t>
-          </w:r>
-          <w:proofErr w:type="gramEnd"/>
-          <w:r>
-            <w:rPr>
-              <w:b/>
-              <w:sz w:val="18"/>
-              <w:szCs w:val="18"/>
-            </w:rPr>
-            <w:t>_comercial</w:t>
-          </w:r>
-          <w:proofErr w:type="spellEnd"/>
-          <w:r>
-            <w:rPr>
-              <w:b/>
-              <w:sz w:val="18"/>
-              <w:szCs w:val="18"/>
-            </w:rPr>
-            <w:t xml:space="preserve"> }}</w:t>
+            <w:t>{{ nombre_comercial }}</w:t>
           </w:r>
         </w:p>
         <w:p>
@@ -1966,51 +1609,13 @@
               <w:szCs w:val="18"/>
             </w:rPr>
           </w:pPr>
-          <w:proofErr w:type="gramStart"/>
           <w:r>
             <w:rPr>
               <w:b/>
               <w:sz w:val="18"/>
               <w:szCs w:val="18"/>
             </w:rPr>
-            <w:t xml:space="preserve">{{ </w:t>
-          </w:r>
-          <w:proofErr w:type="spellStart"/>
-          <w:r>
-            <w:rPr>
-              <w:b/>
-              <w:sz w:val="18"/>
-              <w:szCs w:val="18"/>
-            </w:rPr>
-            <w:t>dia</w:t>
-          </w:r>
-          <w:proofErr w:type="spellEnd"/>
-          <w:proofErr w:type="gramEnd"/>
-          <w:r>
-            <w:rPr>
-              <w:b/>
-              <w:sz w:val="18"/>
-              <w:szCs w:val="18"/>
-            </w:rPr>
-            <w:t xml:space="preserve"> }} DE {{ mes }} DE {{ </w:t>
-          </w:r>
-          <w:proofErr w:type="spellStart"/>
-          <w:r>
-            <w:rPr>
-              <w:b/>
-              <w:sz w:val="18"/>
-              <w:szCs w:val="18"/>
-            </w:rPr>
-            <w:t>anio</w:t>
-          </w:r>
-          <w:proofErr w:type="spellEnd"/>
-          <w:r>
-            <w:rPr>
-              <w:b/>
-              <w:sz w:val="18"/>
-              <w:szCs w:val="18"/>
-            </w:rPr>
-            <w:t xml:space="preserve"> }}</w:t>
+            <w:t>{{ dia }} DE {{ mes }} DE {{ anio }}</w:t>
           </w:r>
         </w:p>
       </w:tc>
@@ -2073,7 +1678,7 @@
 </file>
 
 <file path=word/numbering.xml><?xml version="1.0" encoding="utf-8"?>
-<w:numbering xmlns:wpc="http://schemas.microsoft.com/office/word/2010/wordprocessingCanvas" xmlns:cx="http://schemas.microsoft.com/office/drawing/2014/chartex" xmlns:cx1="http://schemas.microsoft.com/office/drawing/2015/9/8/chartex" xmlns:cx2="http://schemas.microsoft.com/office/drawing/2015/10/21/chartex" xmlns:cx3="http://schemas.microsoft.com/office/drawing/2016/5/9/chartex" xmlns:cx4="http://schemas.microsoft.com/office/drawing/2016/5/10/chartex" xmlns:cx5="http://schemas.microsoft.com/office/drawing/2016/5/11/chartex" xmlns:cx6="http://schemas.microsoft.com/office/drawing/2016/5/12/chartex" xmlns:cx7="http://schemas.microsoft.com/office/drawing/2016/5/13/chartex" xmlns:cx8="http://schemas.microsoft.com/office/drawing/2016/5/14/chartex" xmlns:mc="http://schemas.openxmlformats.org/markup-compatibility/2006" xmlns:aink="http://schemas.microsoft.com/office/drawing/2016/ink" xmlns:am3d="http://schemas.microsoft.com/office/drawing/2017/model3d" xmlns:o="urn:schemas-microsoft-com:office:office" xmlns:oel="http://schemas.microsoft.com/office/2019/extlst" xmlns:r="http://schemas.openxmlformats.org/officeDocument/2006/relationships" xmlns:m="http://schemas.openxmlformats.org/officeDocument/2006/math" xmlns:v="urn:schemas-microsoft-com:vml" xmlns:wp14="http://schemas.microsoft.com/office/word/2010/wordprocessingDrawing" xmlns:wp="http://schemas.openxmlformats.org/drawingml/2006/wordprocessingDrawing" xmlns:w10="urn:schemas-microsoft-com:office:word" xmlns:w="http://schemas.openxmlformats.org/wordprocessingml/2006/main" xmlns:w14="http://schemas.microsoft.com/office/word/2010/wordml" xmlns:w15="http://schemas.microsoft.com/office/word/2012/wordml" xmlns:w16cex="http://schemas.microsoft.com/office/word/2018/wordml/cex" xmlns:w16cid="http://schemas.microsoft.com/office/word/2016/wordml/cid" xmlns:w16="http://schemas.microsoft.com/office/word/2018/wordml" xmlns:w16sdtdh="http://schemas.microsoft.com/office/word/2020/wordml/sdtdatahash" xmlns:w16se="http://schemas.microsoft.com/office/word/2015/wordml/symex" xmlns:wpg="http://schemas.microsoft.com/office/word/2010/wordprocessingGroup" xmlns:wpi="http://schemas.microsoft.com/office/word/2010/wordprocessingInk" xmlns:wne="http://schemas.microsoft.com/office/word/2006/wordml" xmlns:wps="http://schemas.microsoft.com/office/word/2010/wordprocessingShape" mc:Ignorable="w14 w15 w16se w16cid w16 w16cex w16sdtdh wp14">
+<w:numbering xmlns:wpc="http://schemas.microsoft.com/office/word/2010/wordprocessingCanvas" xmlns:cx="http://schemas.microsoft.com/office/drawing/2014/chartex" xmlns:cx1="http://schemas.microsoft.com/office/drawing/2015/9/8/chartex" xmlns:cx2="http://schemas.microsoft.com/office/drawing/2015/10/21/chartex" xmlns:cx3="http://schemas.microsoft.com/office/drawing/2016/5/9/chartex" xmlns:cx4="http://schemas.microsoft.com/office/drawing/2016/5/10/chartex" xmlns:cx5="http://schemas.microsoft.com/office/drawing/2016/5/11/chartex" xmlns:cx6="http://schemas.microsoft.com/office/drawing/2016/5/12/chartex" xmlns:cx7="http://schemas.microsoft.com/office/drawing/2016/5/13/chartex" xmlns:cx8="http://schemas.microsoft.com/office/drawing/2016/5/14/chartex" xmlns:mc="http://schemas.openxmlformats.org/markup-compatibility/2006" xmlns:aink="http://schemas.microsoft.com/office/drawing/2016/ink" xmlns:am3d="http://schemas.microsoft.com/office/drawing/2017/model3d" xmlns:o="urn:schemas-microsoft-com:office:office" xmlns:oel="http://schemas.microsoft.com/office/2019/extlst" xmlns:r="http://schemas.openxmlformats.org/officeDocument/2006/relationships" xmlns:m="http://schemas.openxmlformats.org/officeDocument/2006/math" xmlns:v="urn:schemas-microsoft-com:vml" xmlns:wp14="http://schemas.microsoft.com/office/word/2010/wordprocessingDrawing" xmlns:wp="http://schemas.openxmlformats.org/drawingml/2006/wordprocessingDrawing" xmlns:w10="urn:schemas-microsoft-com:office:word" xmlns:w="http://schemas.openxmlformats.org/wordprocessingml/2006/main" xmlns:w14="http://schemas.microsoft.com/office/word/2010/wordml" xmlns:w15="http://schemas.microsoft.com/office/word/2012/wordml" xmlns:w16cex="http://schemas.microsoft.com/office/word/2018/wordml/cex" xmlns:w16cid="http://schemas.microsoft.com/office/word/2016/wordml/cid" xmlns:w16="http://schemas.microsoft.com/office/word/2018/wordml" xmlns:w16du="http://schemas.microsoft.com/office/word/2023/wordml/word16du" xmlns:w16sdtdh="http://schemas.microsoft.com/office/word/2020/wordml/sdtdatahash" xmlns:w16se="http://schemas.microsoft.com/office/word/2015/wordml/symex" xmlns:wpg="http://schemas.microsoft.com/office/word/2010/wordprocessingGroup" xmlns:wpi="http://schemas.microsoft.com/office/word/2010/wordprocessingInk" xmlns:wne="http://schemas.microsoft.com/office/word/2006/wordml" xmlns:wps="http://schemas.microsoft.com/office/word/2010/wordprocessingShape" mc:Ignorable="w14 w15 w16se w16cid w16 w16cex w16sdtdh w16du wp14">
   <w:abstractNum w:abstractNumId="0" w15:restartNumberingAfterBreak="0">
     <w:nsid w:val="337845FB"/>
     <w:multiLevelType w:val="hybridMultilevel"/>
@@ -2197,7 +1802,7 @@
 </file>
 
 <file path=word/styles.xml><?xml version="1.0" encoding="utf-8"?>
-<w:styles xmlns:mc="http://schemas.openxmlformats.org/markup-compatibility/2006" xmlns:r="http://schemas.openxmlformats.org/officeDocument/2006/relationships" xmlns:w="http://schemas.openxmlformats.org/wordprocessingml/2006/main" xmlns:w14="http://schemas.microsoft.com/office/word/2010/wordml" xmlns:w15="http://schemas.microsoft.com/office/word/2012/wordml" xmlns:w16cex="http://schemas.microsoft.com/office/word/2018/wordml/cex" xmlns:w16cid="http://schemas.microsoft.com/office/word/2016/wordml/cid" xmlns:w16="http://schemas.microsoft.com/office/word/2018/wordml" xmlns:w16sdtdh="http://schemas.microsoft.com/office/word/2020/wordml/sdtdatahash" xmlns:w16se="http://schemas.microsoft.com/office/word/2015/wordml/symex" mc:Ignorable="w14 w15 w16se w16cid w16 w16cex w16sdtdh">
+<w:styles xmlns:mc="http://schemas.openxmlformats.org/markup-compatibility/2006" xmlns:r="http://schemas.openxmlformats.org/officeDocument/2006/relationships" xmlns:w="http://schemas.openxmlformats.org/wordprocessingml/2006/main" xmlns:w14="http://schemas.microsoft.com/office/word/2010/wordml" xmlns:w15="http://schemas.microsoft.com/office/word/2012/wordml" xmlns:w16cex="http://schemas.microsoft.com/office/word/2018/wordml/cex" xmlns:w16cid="http://schemas.microsoft.com/office/word/2016/wordml/cid" xmlns:w16="http://schemas.microsoft.com/office/word/2018/wordml" xmlns:w16du="http://schemas.microsoft.com/office/word/2023/wordml/word16du" xmlns:w16sdtdh="http://schemas.microsoft.com/office/word/2020/wordml/sdtdatahash" xmlns:w16se="http://schemas.microsoft.com/office/word/2015/wordml/symex" mc:Ignorable="w14 w15 w16se w16cid w16 w16cex w16sdtdh w16du">
   <w:docDefaults>
     <w:rPrDefault>
       <w:rPr>

</xml_diff>

<commit_message>
Ajuste tamano de imagenes
</commit_message>
<xml_diff>
--- a/Inputs/Templates/MF BBVA.docx
+++ b/Inputs/Templates/MF BBVA.docx
@@ -75,37 +75,12 @@
             <w:r>
               <w:t xml:space="preserve">La sucursal </w:t>
             </w:r>
-            <w:proofErr w:type="gramStart"/>
             <w:r>
               <w:rPr>
                 <w:b/>
                 <w:bCs/>
               </w:rPr>
-              <w:t xml:space="preserve">{{ </w:t>
-            </w:r>
-            <w:proofErr w:type="spellStart"/>
-            <w:r>
-              <w:rPr>
-                <w:b/>
-                <w:bCs/>
-              </w:rPr>
-              <w:t>nombre</w:t>
-            </w:r>
-            <w:proofErr w:type="gramEnd"/>
-            <w:r>
-              <w:rPr>
-                <w:b/>
-                <w:bCs/>
-              </w:rPr>
-              <w:t>_comercial</w:t>
-            </w:r>
-            <w:proofErr w:type="spellEnd"/>
-            <w:r>
-              <w:rPr>
-                <w:b/>
-                <w:bCs/>
-              </w:rPr>
-              <w:t xml:space="preserve"> }}</w:t>
+              <w:t>{{ nombre_comercial }}</w:t>
             </w:r>
             <w:r>
               <w:t xml:space="preserve"> se ubica frente a una vialidad altamente transitada, colinda con otros inmuebles de servicios con giro comercial. </w:t>
@@ -119,36 +94,23 @@
             <w:r>
               <w:t xml:space="preserve">El horario de atención de servicios </w:t>
             </w:r>
-            <w:proofErr w:type="gramStart"/>
-            <w:r>
-              <w:t>{{ horario</w:t>
-            </w:r>
-            <w:proofErr w:type="gramEnd"/>
-            <w:r>
-              <w:t xml:space="preserve"> }}</w:t>
-            </w:r>
-          </w:p>
-          <w:p>
-            <w:pPr>
-              <w:spacing w:before="0"/>
-              <w:jc w:val="both"/>
-            </w:pPr>
-          </w:p>
-          <w:p>
-            <w:pPr>
-              <w:spacing w:before="0"/>
-              <w:jc w:val="both"/>
-            </w:pPr>
-            <w:r>
-              <w:t xml:space="preserve">Cuenta con </w:t>
-            </w:r>
-            <w:proofErr w:type="gramStart"/>
-            <w:r>
-              <w:t>{{ trabajadores</w:t>
-            </w:r>
-            <w:proofErr w:type="gramEnd"/>
-            <w:r>
-              <w:t xml:space="preserve"> }} empleados fijos y afluencia durante el día de {{ visitantes }} personas.</w:t>
+            <w:r>
+              <w:t>{{ horario }}</w:t>
+            </w:r>
+          </w:p>
+          <w:p>
+            <w:pPr>
+              <w:spacing w:before="0"/>
+              <w:jc w:val="both"/>
+            </w:pPr>
+          </w:p>
+          <w:p>
+            <w:pPr>
+              <w:spacing w:before="0"/>
+              <w:jc w:val="both"/>
+            </w:pPr>
+            <w:r>
+              <w:t>Cuenta con {{ trabajadores }} empleados fijos y afluencia durante el día de {{ visitantes }} personas.</w:t>
             </w:r>
           </w:p>
         </w:tc>
@@ -162,13 +124,8 @@
               <w:spacing w:before="0"/>
               <w:jc w:val="center"/>
             </w:pPr>
-            <w:proofErr w:type="gramStart"/>
-            <w:r>
-              <w:t>{{ fachada</w:t>
-            </w:r>
-            <w:proofErr w:type="gramEnd"/>
-            <w:r>
-              <w:t>1 }}</w:t>
+            <w:r>
+              <w:t>{{ fachada1 }}</w:t>
             </w:r>
           </w:p>
         </w:tc>
@@ -231,13 +188,8 @@
               <w:spacing w:before="0"/>
               <w:jc w:val="center"/>
             </w:pPr>
-            <w:proofErr w:type="gramStart"/>
-            <w:r>
-              <w:t>{{ mueble</w:t>
-            </w:r>
-            <w:proofErr w:type="gramEnd"/>
-            <w:r>
-              <w:t>1 }}</w:t>
+            <w:r>
+              <w:t>{{ mueble1 }}</w:t>
             </w:r>
           </w:p>
         </w:tc>
@@ -295,13 +247,8 @@
               <w:spacing w:before="0"/>
               <w:jc w:val="center"/>
             </w:pPr>
-            <w:proofErr w:type="gramStart"/>
-            <w:r>
-              <w:t>{{ ruta</w:t>
-            </w:r>
-            <w:proofErr w:type="gramEnd"/>
-            <w:r>
-              <w:t>1 }}</w:t>
+            <w:r>
+              <w:t>{{ ruta1 }}</w:t>
             </w:r>
           </w:p>
         </w:tc>
@@ -391,14 +338,12 @@
               <w:spacing w:before="0"/>
               <w:jc w:val="center"/>
             </w:pPr>
-            <w:proofErr w:type="gramStart"/>
             <w:r>
               <w:t xml:space="preserve">{{ </w:t>
             </w:r>
             <w:r>
               <w:t>ext</w:t>
             </w:r>
-            <w:proofErr w:type="gramEnd"/>
             <w:r>
               <w:t>1 }}</w:t>
             </w:r>
@@ -454,14 +399,12 @@
               <w:spacing w:before="0"/>
               <w:jc w:val="center"/>
             </w:pPr>
-            <w:proofErr w:type="gramStart"/>
             <w:r>
               <w:t xml:space="preserve">{{ </w:t>
             </w:r>
             <w:r>
               <w:t>techo</w:t>
             </w:r>
-            <w:proofErr w:type="gramEnd"/>
             <w:r>
               <w:t xml:space="preserve"> }}</w:t>
             </w:r>
@@ -508,21 +451,8 @@
               <w:tab/>
               <w:t xml:space="preserve">Se cuenta con un plan de emergencia para casos de incendio, definido en el presente Programa interno de Protección civil, mismo que debe ser difundido y socializado con el personal de la Sucursal </w:t>
             </w:r>
-            <w:proofErr w:type="gramStart"/>
-            <w:r>
-              <w:t xml:space="preserve">{{ </w:t>
-            </w:r>
-            <w:proofErr w:type="spellStart"/>
-            <w:r>
-              <w:t>nombre</w:t>
-            </w:r>
-            <w:proofErr w:type="gramEnd"/>
-            <w:r>
-              <w:t>_comercial</w:t>
-            </w:r>
-            <w:proofErr w:type="spellEnd"/>
-            <w:r>
-              <w:t xml:space="preserve"> }}</w:t>
+            <w:r>
+              <w:t>{{ nombre_comercial }}</w:t>
             </w:r>
             <w:r>
               <w:t>, así como observar en el inmueble los requisitos de la NOM 002 STPS 2010 para centros de trabajo.</w:t>
@@ -541,16 +471,11 @@
               <w:spacing w:before="0"/>
               <w:jc w:val="center"/>
             </w:pPr>
-            <w:proofErr w:type="gramStart"/>
             <w:r>
               <w:t xml:space="preserve">{{ </w:t>
             </w:r>
             <w:r>
-              <w:t>sim</w:t>
-            </w:r>
-            <w:proofErr w:type="gramEnd"/>
-            <w:r>
-              <w:t>3</w:t>
+              <w:t>sim3</w:t>
             </w:r>
             <w:r>
               <w:t xml:space="preserve"> }}</w:t>
@@ -568,16 +493,11 @@
               <w:spacing w:before="0"/>
               <w:jc w:val="center"/>
             </w:pPr>
-            <w:proofErr w:type="gramStart"/>
             <w:r>
               <w:t xml:space="preserve">{{ </w:t>
             </w:r>
             <w:r>
-              <w:t>sim</w:t>
-            </w:r>
-            <w:proofErr w:type="gramEnd"/>
-            <w:r>
-              <w:t>4</w:t>
+              <w:t>sim4</w:t>
             </w:r>
             <w:r>
               <w:t xml:space="preserve"> }}</w:t>
@@ -586,16 +506,6 @@
         </w:tc>
       </w:tr>
     </w:tbl>
-    <w:p>
-      <w:pPr>
-        <w:widowControl/>
-        <w:spacing w:before="0" w:after="160" w:line="259" w:lineRule="auto"/>
-        <w:rPr>
-          <w:b/>
-          <w:szCs w:val="20"/>
-        </w:rPr>
-      </w:pPr>
-    </w:p>
     <w:p>
       <w:pPr>
         <w:widowControl/>
@@ -651,29 +561,11 @@
             <w:r>
               <w:t xml:space="preserve">Ventanas se desconoce característica de intemperización de cristalería, así como espacios de islas de trabajo, cuenta con película </w:t>
             </w:r>
-            <w:proofErr w:type="spellStart"/>
             <w:r>
               <w:t>anti-estallido</w:t>
             </w:r>
-            <w:proofErr w:type="spellEnd"/>
-            <w:r>
-              <w:t xml:space="preserve">. Los tramos de herrería se encuentran pintados sin presentar corrosión, incluido en programa de revisión en </w:t>
-            </w:r>
-            <w:proofErr w:type="spellStart"/>
-            <w:r>
-              <w:t>sujecio</w:t>
-            </w:r>
-            <w:proofErr w:type="spellEnd"/>
-            <w:r>
-              <w:t xml:space="preserve"> </w:t>
-            </w:r>
-            <w:proofErr w:type="spellStart"/>
-            <w:r>
-              <w:t>nes</w:t>
-            </w:r>
-            <w:proofErr w:type="spellEnd"/>
-            <w:r>
-              <w:t xml:space="preserve"> y uniones para evitar piezas en mal estado que condicionen accidente laboral.</w:t>
+            <w:r>
+              <w:t>. Los tramos de herrería se encuentran pintados sin presentar corrosión, incluido en programa de revisión en sujecio nes y uniones para evitar piezas en mal estado que condicionen accidente laboral.</w:t>
             </w:r>
           </w:p>
         </w:tc>
@@ -687,13 +579,8 @@
               <w:spacing w:before="0"/>
               <w:jc w:val="center"/>
             </w:pPr>
-            <w:proofErr w:type="gramStart"/>
-            <w:r>
-              <w:t>{{ ventanas</w:t>
-            </w:r>
-            <w:proofErr w:type="gramEnd"/>
-            <w:r>
-              <w:t xml:space="preserve"> }}</w:t>
+            <w:r>
+              <w:t>{{ ventanas }}</w:t>
             </w:r>
           </w:p>
         </w:tc>
@@ -774,13 +661,8 @@
               <w:spacing w:before="0"/>
               <w:jc w:val="center"/>
             </w:pPr>
-            <w:proofErr w:type="gramStart"/>
-            <w:r>
-              <w:t>{{ estantes</w:t>
-            </w:r>
-            <w:proofErr w:type="gramEnd"/>
-            <w:r>
-              <w:t xml:space="preserve"> }}</w:t>
+            <w:r>
+              <w:t>{{ estantes }}</w:t>
             </w:r>
           </w:p>
         </w:tc>
@@ -861,13 +743,8 @@
               <w:spacing w:before="0"/>
               <w:jc w:val="center"/>
             </w:pPr>
-            <w:proofErr w:type="gramStart"/>
-            <w:r>
-              <w:t>{{ pisos</w:t>
-            </w:r>
-            <w:proofErr w:type="gramEnd"/>
-            <w:r>
-              <w:t xml:space="preserve"> }}</w:t>
+            <w:r>
+              <w:t>{{ pisos }}</w:t>
             </w:r>
           </w:p>
         </w:tc>
@@ -972,18 +849,8 @@
               <w:spacing w:before="0"/>
               <w:jc w:val="center"/>
             </w:pPr>
-            <w:proofErr w:type="gramStart"/>
-            <w:r>
-              <w:t xml:space="preserve">{{ </w:t>
-            </w:r>
-            <w:proofErr w:type="spellStart"/>
-            <w:r>
-              <w:t>electrico</w:t>
-            </w:r>
-            <w:proofErr w:type="spellEnd"/>
-            <w:proofErr w:type="gramEnd"/>
-            <w:r>
-              <w:t xml:space="preserve"> </w:t>
+            <w:r>
+              <w:t xml:space="preserve">{{ electrico </w:t>
             </w:r>
             <w:r>
               <w:t>}}</w:t>
@@ -1061,16 +928,12 @@
               <w:spacing w:before="0"/>
               <w:jc w:val="center"/>
             </w:pPr>
-            <w:proofErr w:type="gramStart"/>
             <w:r>
               <w:t xml:space="preserve">{{ </w:t>
             </w:r>
-            <w:proofErr w:type="spellStart"/>
             <w:r>
               <w:t>bateria</w:t>
             </w:r>
-            <w:proofErr w:type="spellEnd"/>
-            <w:proofErr w:type="gramEnd"/>
             <w:r>
               <w:t xml:space="preserve"> }}</w:t>
             </w:r>
@@ -1156,14 +1019,12 @@
               <w:spacing w:before="0"/>
               <w:jc w:val="center"/>
             </w:pPr>
-            <w:proofErr w:type="gramStart"/>
             <w:r>
               <w:t xml:space="preserve">{{ </w:t>
             </w:r>
             <w:r>
               <w:t>alarma</w:t>
             </w:r>
-            <w:proofErr w:type="gramEnd"/>
             <w:r>
               <w:t xml:space="preserve"> }}</w:t>
             </w:r>
@@ -1254,18 +1115,11 @@
               <w:spacing w:before="0"/>
               <w:jc w:val="center"/>
             </w:pPr>
-            <w:proofErr w:type="gramStart"/>
             <w:r>
               <w:t xml:space="preserve">{{ </w:t>
             </w:r>
-            <w:proofErr w:type="spellStart"/>
-            <w:r>
-              <w:t>banio</w:t>
-            </w:r>
-            <w:proofErr w:type="spellEnd"/>
-            <w:proofErr w:type="gramEnd"/>
-            <w:r>
-              <w:t xml:space="preserve"> </w:t>
+            <w:r>
+              <w:t xml:space="preserve">banio </w:t>
             </w:r>
             <w:r>
               <w:t>}}</w:t>
@@ -1332,23 +1186,7 @@
               <w:tab/>
             </w:r>
             <w:r>
-              <w:t xml:space="preserve">El Cuarto </w:t>
-            </w:r>
-            <w:proofErr w:type="spellStart"/>
-            <w:r>
-              <w:t>on</w:t>
-            </w:r>
-            <w:proofErr w:type="spellEnd"/>
-            <w:r>
-              <w:t xml:space="preserve"> Line se encuentra restringido en su acceso, limpio de almacenaje de combustibles sólidos y otros, con detector de humo vigente, toda la instalación eléctrica bajo resguardo tubo </w:t>
-            </w:r>
-            <w:proofErr w:type="spellStart"/>
-            <w:r>
-              <w:t>conduit</w:t>
-            </w:r>
-            <w:proofErr w:type="spellEnd"/>
-            <w:r>
-              <w:t>, señalizado en sus tableros de control, con sistema de ventilación adecuado.</w:t>
+              <w:t>El Cuarto on Line se encuentra restringido en su acceso, limpio de almacenaje de combustibles sólidos y otros, con detector de humo vigente, toda la instalación eléctrica bajo resguardo tubo conduit, señalizado en sus tableros de control, con sistema de ventilación adecuado.</w:t>
             </w:r>
           </w:p>
         </w:tc>
@@ -1362,14 +1200,12 @@
               <w:spacing w:before="0"/>
               <w:jc w:val="center"/>
             </w:pPr>
-            <w:proofErr w:type="gramStart"/>
             <w:r>
               <w:t xml:space="preserve">{{ </w:t>
             </w:r>
             <w:r>
               <w:t>site</w:t>
             </w:r>
-            <w:proofErr w:type="gramEnd"/>
             <w:r>
               <w:t xml:space="preserve"> }}</w:t>
             </w:r>
@@ -1461,14 +1297,12 @@
               <w:spacing w:before="0"/>
               <w:jc w:val="center"/>
             </w:pPr>
-            <w:proofErr w:type="gramStart"/>
             <w:r>
               <w:t xml:space="preserve">{{ </w:t>
             </w:r>
             <w:r>
               <w:t>puerta</w:t>
             </w:r>
-            <w:proofErr w:type="gramEnd"/>
             <w:r>
               <w:t xml:space="preserve"> }}</w:t>
             </w:r>
@@ -1646,11 +1480,9 @@
             <w:r>
               <w:t xml:space="preserve">{{ </w:t>
             </w:r>
-            <w:proofErr w:type="spellStart"/>
             <w:r>
               <w:t>botiquin</w:t>
             </w:r>
-            <w:proofErr w:type="spellEnd"/>
             <w:r>
               <w:t xml:space="preserve"> }}</w:t>
             </w:r>
@@ -1724,11 +1556,9 @@
             <w:r>
               <w:t xml:space="preserve">{{ </w:t>
             </w:r>
-            <w:proofErr w:type="spellStart"/>
             <w:r>
               <w:t>dh</w:t>
             </w:r>
-            <w:proofErr w:type="spellEnd"/>
             <w:r>
               <w:t xml:space="preserve"> }}</w:t>
             </w:r>
@@ -1778,34 +1608,7 @@
           <w:lang w:val="en-US"/>
         </w:rPr>
         <w:lastRenderedPageBreak/>
-        <w:t xml:space="preserve">Lay out </w:t>
-      </w:r>
-      <w:proofErr w:type="spellStart"/>
-      <w:r>
-        <w:rPr>
-          <w:b/>
-          <w:sz w:val="32"/>
-          <w:lang w:val="en-US"/>
-        </w:rPr>
-        <w:t>Sucursal</w:t>
-      </w:r>
-      <w:proofErr w:type="spellEnd"/>
-      <w:r>
-        <w:rPr>
-          <w:b/>
-          <w:sz w:val="32"/>
-          <w:lang w:val="en-US"/>
-        </w:rPr>
-        <w:t xml:space="preserve"> {{ </w:t>
-      </w:r>
-      <w:proofErr w:type="spellStart"/>
-      <w:r>
-        <w:rPr>
-          <w:b/>
-          <w:sz w:val="32"/>
-          <w:lang w:val="en-US"/>
-        </w:rPr>
-        <w:t>nombre_com</w:t>
+        <w:t>Lay out Sucursal {{ nombre_com</w:t>
       </w:r>
       <w:r>
         <w:rPr>
@@ -1813,16 +1616,7 @@
           <w:sz w:val="32"/>
           <w:lang w:val="en-US"/>
         </w:rPr>
-        <w:t>ercial</w:t>
-      </w:r>
-      <w:proofErr w:type="spellEnd"/>
-      <w:r>
-        <w:rPr>
-          <w:b/>
-          <w:sz w:val="32"/>
-          <w:lang w:val="en-US"/>
-        </w:rPr>
-        <w:t xml:space="preserve"> }}</w:t>
+        <w:t>ercial }}</w:t>
       </w:r>
     </w:p>
     <w:p>
@@ -1850,74 +1644,18 @@
         <w:rPr>
           <w:b/>
         </w:rPr>
-        <w:t xml:space="preserve">{{ </w:t>
+        <w:t>{{ nombre_comercial }}</w:t>
       </w:r>
-      <w:proofErr w:type="spellStart"/>
+    </w:p>
+    <w:p>
+      <w:pPr>
+        <w:jc w:val="center"/>
+      </w:pPr>
       <w:r>
         <w:rPr>
           <w:b/>
         </w:rPr>
-        <w:t>nombre_comercial</w:t>
-      </w:r>
-      <w:proofErr w:type="spellEnd"/>
-      <w:r>
-        <w:rPr>
-          <w:b/>
-        </w:rPr>
-        <w:t xml:space="preserve"> }}</w:t>
-      </w:r>
-    </w:p>
-    <w:p>
-      <w:pPr>
-        <w:jc w:val="center"/>
-      </w:pPr>
-      <w:r>
-        <w:rPr>
-          <w:b/>
-        </w:rPr>
-        <w:t xml:space="preserve">{{ calle }} No. {{ </w:t>
-      </w:r>
-      <w:proofErr w:type="spellStart"/>
-      <w:r>
-        <w:rPr>
-          <w:b/>
-        </w:rPr>
-        <w:t>no_exterior</w:t>
-      </w:r>
-      <w:proofErr w:type="spellEnd"/>
-      <w:r>
-        <w:rPr>
-          <w:b/>
-        </w:rPr>
-        <w:t xml:space="preserve"> }}{{ </w:t>
-      </w:r>
-      <w:proofErr w:type="spellStart"/>
-      <w:r>
-        <w:rPr>
-          <w:b/>
-        </w:rPr>
-        <w:t>no_interior</w:t>
-      </w:r>
-      <w:proofErr w:type="spellEnd"/>
-      <w:r>
-        <w:rPr>
-          <w:b/>
-        </w:rPr>
-        <w:t xml:space="preserve"> }}, Col. {{ </w:t>
-      </w:r>
-      <w:proofErr w:type="spellStart"/>
-      <w:r>
-        <w:rPr>
-          <w:b/>
-        </w:rPr>
-        <w:t>colonia_barrio</w:t>
-      </w:r>
-      <w:proofErr w:type="spellEnd"/>
-      <w:r>
-        <w:rPr>
-          <w:b/>
-        </w:rPr>
-        <w:t xml:space="preserve"> }}, {{ municipio }}, {{ estado }}</w:t>
+        <w:t>{{ calle }} No. {{ no_exterior }}{{ no_interior }}, Col. {{ colonia_barrio }}, {{ municipio }}, {{ estado }}</w:t>
       </w:r>
       <w:r>
         <w:rPr>
@@ -1959,6 +1697,13 @@
       </w:r>
     </w:p>
   </w:endnote>
+  <w:endnote w:type="continuationNotice" w:id="1">
+    <w:p>
+      <w:pPr>
+        <w:spacing w:before="0"/>
+      </w:pPr>
+    </w:p>
+  </w:endnote>
 </w:endnotes>
 </file>
 
@@ -1982,6 +1727,13 @@
       <w:r>
         <w:continuationSeparator/>
       </w:r>
+    </w:p>
+  </w:footnote>
+  <w:footnote w:type="continuationNotice" w:id="1">
+    <w:p>
+      <w:pPr>
+        <w:spacing w:before="0"/>
+      </w:pPr>
     </w:p>
   </w:footnote>
 </w:footnotes>
@@ -2033,7 +1785,7 @@
               <w:noProof/>
             </w:rPr>
             <w:drawing>
-              <wp:anchor distT="0" distB="0" distL="114300" distR="114300" simplePos="0" relativeHeight="251659264" behindDoc="1" locked="0" layoutInCell="1" allowOverlap="1" wp14:anchorId="0C530C29" wp14:editId="690627EE">
+              <wp:anchor distT="0" distB="0" distL="114300" distR="114300" simplePos="0" relativeHeight="251658240" behindDoc="1" locked="0" layoutInCell="1" allowOverlap="1" wp14:anchorId="0C530C29" wp14:editId="690627EE">
                 <wp:simplePos x="0" y="0"/>
                 <wp:positionH relativeFrom="column">
                   <wp:posOffset>198546</wp:posOffset>
@@ -2118,41 +1870,13 @@
               <w:szCs w:val="18"/>
             </w:rPr>
           </w:pPr>
-          <w:proofErr w:type="gramStart"/>
           <w:r>
             <w:rPr>
               <w:b/>
               <w:sz w:val="18"/>
               <w:szCs w:val="18"/>
             </w:rPr>
-            <w:t xml:space="preserve">{{ </w:t>
-          </w:r>
-          <w:proofErr w:type="spellStart"/>
-          <w:r>
-            <w:rPr>
-              <w:b/>
-              <w:sz w:val="18"/>
-              <w:szCs w:val="18"/>
-            </w:rPr>
-            <w:t>nombre</w:t>
-          </w:r>
-          <w:proofErr w:type="gramEnd"/>
-          <w:r>
-            <w:rPr>
-              <w:b/>
-              <w:sz w:val="18"/>
-              <w:szCs w:val="18"/>
-            </w:rPr>
-            <w:t>_comercial</w:t>
-          </w:r>
-          <w:proofErr w:type="spellEnd"/>
-          <w:r>
-            <w:rPr>
-              <w:b/>
-              <w:sz w:val="18"/>
-              <w:szCs w:val="18"/>
-            </w:rPr>
-            <w:t xml:space="preserve"> }}</w:t>
+            <w:t>{{ nombre_comercial }}</w:t>
           </w:r>
         </w:p>
         <w:p>
@@ -2165,51 +1889,13 @@
               <w:szCs w:val="18"/>
             </w:rPr>
           </w:pPr>
-          <w:proofErr w:type="gramStart"/>
           <w:r>
             <w:rPr>
               <w:b/>
               <w:sz w:val="18"/>
               <w:szCs w:val="18"/>
             </w:rPr>
-            <w:t xml:space="preserve">{{ </w:t>
-          </w:r>
-          <w:proofErr w:type="spellStart"/>
-          <w:r>
-            <w:rPr>
-              <w:b/>
-              <w:sz w:val="18"/>
-              <w:szCs w:val="18"/>
-            </w:rPr>
-            <w:t>dia</w:t>
-          </w:r>
-          <w:proofErr w:type="spellEnd"/>
-          <w:proofErr w:type="gramEnd"/>
-          <w:r>
-            <w:rPr>
-              <w:b/>
-              <w:sz w:val="18"/>
-              <w:szCs w:val="18"/>
-            </w:rPr>
-            <w:t xml:space="preserve"> }} DE {{ mes }} DE {{ </w:t>
-          </w:r>
-          <w:proofErr w:type="spellStart"/>
-          <w:r>
-            <w:rPr>
-              <w:b/>
-              <w:sz w:val="18"/>
-              <w:szCs w:val="18"/>
-            </w:rPr>
-            <w:t>anio</w:t>
-          </w:r>
-          <w:proofErr w:type="spellEnd"/>
-          <w:r>
-            <w:rPr>
-              <w:b/>
-              <w:sz w:val="18"/>
-              <w:szCs w:val="18"/>
-            </w:rPr>
-            <w:t xml:space="preserve"> }}</w:t>
+            <w:t>{{ dia }} DE {{ mes }} DE {{ anio }}</w:t>
           </w:r>
         </w:p>
       </w:tc>
@@ -2227,41 +1913,13 @@
               <w:szCs w:val="18"/>
             </w:rPr>
           </w:pPr>
-          <w:proofErr w:type="gramStart"/>
           <w:r>
             <w:rPr>
               <w:b/>
               <w:sz w:val="18"/>
               <w:szCs w:val="18"/>
             </w:rPr>
-            <w:t xml:space="preserve">{{ </w:t>
-          </w:r>
-          <w:proofErr w:type="spellStart"/>
-          <w:r>
-            <w:rPr>
-              <w:b/>
-              <w:sz w:val="18"/>
-              <w:szCs w:val="18"/>
-            </w:rPr>
-            <w:t>registro</w:t>
-          </w:r>
-          <w:proofErr w:type="gramEnd"/>
-          <w:r>
-            <w:rPr>
-              <w:b/>
-              <w:sz w:val="18"/>
-              <w:szCs w:val="18"/>
-            </w:rPr>
-            <w:t>_perito</w:t>
-          </w:r>
-          <w:proofErr w:type="spellEnd"/>
-          <w:r>
-            <w:rPr>
-              <w:b/>
-              <w:sz w:val="18"/>
-              <w:szCs w:val="18"/>
-            </w:rPr>
-            <w:t xml:space="preserve"> }}</w:t>
+            <w:t>{{ registro_perito }}</w:t>
           </w:r>
         </w:p>
         <w:p>
@@ -2274,23 +1932,13 @@
               <w:szCs w:val="18"/>
             </w:rPr>
           </w:pPr>
-          <w:proofErr w:type="gramStart"/>
           <w:r>
             <w:rPr>
               <w:b/>
               <w:sz w:val="18"/>
               <w:szCs w:val="18"/>
             </w:rPr>
-            <w:t>{{ no</w:t>
-          </w:r>
-          <w:proofErr w:type="gramEnd"/>
-          <w:r>
-            <w:rPr>
-              <w:b/>
-              <w:sz w:val="18"/>
-              <w:szCs w:val="18"/>
-            </w:rPr>
-            <w:t>_registro }}</w:t>
+            <w:t>{{ no_registro }}</w:t>
           </w:r>
         </w:p>
       </w:tc>

</xml_diff>